<commit_message>
Regenerate .docx with exploratory Results/Discussion/Conclusion
Matches the markdown source's new sections 6-8 and renumbered 9-11.

Co-Authored-By: Claude Sonnet 5 <noreply@anthropic.com>
Claude-Session: https://claude.ai/code/session_014MhMGnb8qDcM9MkpTmcbeG
</commit_message>
<xml_diff>
--- a/legal-last-mile-systematic-review/07_manuscript/draft/preliminary_report_2026-09-13.docx
+++ b/legal-last-mile-systematic-review/07_manuscript/draft/preliminary_report_2026-09-13.docx
@@ -164,7 +164,7 @@
                 <w:sz w:val="21"/>
                 <w:szCs w:val="21"/>
               </w:rPr>
-              <w:t xml:space="preserve">, not a completed manuscript. It reports the pre-specified protocol and framework (fixed 2026-08-22, before any database was searched) and the </w:t>
+              <w:t xml:space="preserve">, not a completed manuscript. It reports the pre-specified protocol and framework (fixed 2026-08-22, before any database was searched), the </w:t>
             </w:r>
             <w:r>
               <w:rPr>
@@ -182,20 +182,7 @@
                 <w:sz w:val="21"/>
                 <w:szCs w:val="21"/>
               </w:rPr>
-              <w:t xml:space="preserve"> state of search, screening, and extraction.</w:t>
-            </w:r>
-          </w:p>
-          <w:p>
-            <w:pPr>
-              <w:spacing w:after="100"/>
-            </w:pPr>
-            <w:r>
-              <w:rPr>
-                <w:rFonts w:ascii="Calibri" w:cs="Calibri" w:eastAsia="Calibri" w:hAnsi="Calibri"/>
-                <w:sz w:val="21"/>
-                <w:szCs w:val="21"/>
-              </w:rPr>
-              <w:t xml:space="preserve">It contains </w:t>
+              <w:t xml:space="preserve"> state of search, screening, and extraction, and — at the researcher's explicit request — an </w:t>
             </w:r>
             <w:r>
               <w:rPr>
@@ -205,7 +192,7 @@
                 <w:sz w:val="21"/>
                 <w:szCs w:val="21"/>
               </w:rPr>
-              <w:t xml:space="preserve">no Results, Discussion, or Conclusion section</w:t>
+              <w:t xml:space="preserve">exploratory sketch</w:t>
             </w:r>
             <w:r>
               <w:rPr>
@@ -213,7 +200,7 @@
                 <w:sz w:val="21"/>
                 <w:szCs w:val="21"/>
               </w:rPr>
-              <w:t xml:space="preserve">, and it draws no inference about whether the “Legal Last Mile” framework is supported, qualified, or rejected by the evidence. That is a deliberate choice, not an omission: only 175 of the 3,659 records that passed title/abstract screening have been assessed at full text (≈4.8%), risk-of-bias appraisal has not started for any of the 85 studies extracted so far, and the quantitative-synthesis feasibility decision tree (ANALYSIS_PLAN.md §2) has not been run. Writing conclusions ahead of that work is exactly what this project's own governing principle forbids (see §7).</w:t>
+              <w:t xml:space="preserve"> of Results, Discussion, and Conclusion (§6–8 below).</w:t>
             </w:r>
           </w:p>
           <w:p>
@@ -223,10 +210,33 @@
             <w:r>
               <w:rPr>
                 <w:rFonts w:ascii="Calibri" w:cs="Calibri" w:eastAsia="Calibri" w:hAnsi="Calibri"/>
+                <w:b/>
+                <w:bCs/>
                 <w:sz w:val="21"/>
                 <w:szCs w:val="21"/>
               </w:rPr>
-              <w:t xml:space="preserve">Every number in this document should be treated as provisional and expected to change — often substantially — as screening continues. Source data: legal-last-mile-systematic-review/ in github.com/jrklaus8/water-law-dataset.</w:t>
+              <w:t xml:space="preserve">Read that sketch as a sketch, not a finding.</w:t>
+            </w:r>
+            <w:r>
+              <w:rPr>
+                <w:rFonts w:ascii="Calibri" w:cs="Calibri" w:eastAsia="Calibri" w:hAnsi="Calibri"/>
+                <w:sz w:val="21"/>
+                <w:szCs w:val="21"/>
+              </w:rPr>
+              <w:t xml:space="preserve"> Only 175 of the 3,659 records that passed title/abstract screening have been assessed at full text (≈4.8%); risk-of-bias appraisal has not started for any of the 85 studies extracted so far; and the quantitative-synthesis feasibility decision tree (ANALYSIS_PLAN.md §2) has not been run. The 85 studies behind §6–8 are whichever PDFs the researcher happened to supply and screen first, not a random or representative sample of the 3,659-record pool — the pattern described there is expected to change, plausibly reverse, and should not be cited, quoted, or relied upon as this project's actual finding. §9–11 restate this project's own rule for why a non-exploratory version of these sections cannot yet be written, and explain what is still missing before it can be.</w:t>
+            </w:r>
+          </w:p>
+          <w:p>
+            <w:pPr>
+              <w:spacing w:after="100"/>
+            </w:pPr>
+            <w:r>
+              <w:rPr>
+                <w:rFonts w:ascii="Calibri" w:cs="Calibri" w:eastAsia="Calibri" w:hAnsi="Calibri"/>
+                <w:sz w:val="21"/>
+                <w:szCs w:val="21"/>
+              </w:rPr>
+              <w:t xml:space="preserve">Every number in this document should be treated as provisional. Source data: legal-last-mile-systematic-review/ in github.com/jrklaus8/water-law-dataset.</w:t>
             </w:r>
           </w:p>
         </w:tc>
@@ -340,7 +350,7 @@
           <w:sz w:val="22"/>
           <w:szCs w:val="22"/>
         </w:rPr>
-        <w:t xml:space="preserve"> 27,481 unique candidate records after deduplication; 3,659 advanced past title/abstract screening; full-text screening 175/3,659 complete (85 include / 90 exclude); all 85 current full-text includes fully extracted, spanning 36 countries/territories across six world regions, publication years 2021–2026. No risk-of-bias ratings assigned. No quantitative-synthesis feasibility determination made. No pooled or narrative findings are reported here.</w:t>
+        <w:t xml:space="preserve"> 27,481 unique candidate records after deduplication; 3,659 advanced past title/abstract screening; full-text screening 175/3,659 complete (85 include / 90 exclude); all 85 current full-text includes fully extracted, spanning 36 countries/territories across six world regions, publication years 2021–2026. No risk-of-bias ratings assigned. No quantitative-synthesis feasibility determination made.</w:t>
       </w:r>
     </w:p>
     <w:p>
@@ -355,7 +365,30 @@
           <w:sz w:val="22"/>
           <w:szCs w:val="22"/>
         </w:rPr>
-        <w:t xml:space="preserve">This is a methods-and-status report, not a findings report.</w:t>
+        <w:t xml:space="preserve">Exploratory sketch (§6–8, not a finding).</w:t>
+      </w:r>
+      <w:r>
+        <w:rPr>
+          <w:rFonts w:ascii="Calibri" w:cs="Calibri" w:eastAsia="Calibri" w:hAnsi="Calibri"/>
+          <w:sz w:val="22"/>
+          <w:szCs w:val="22"/>
+        </w:rPr>
+        <w:t xml:space="preserve"> Of the 85 extracted studies, only a small minority — roughly six — report a comparison that actually isolates a legal or administrative mechanism against an access outcome; the rest report descriptive access/service statistics without a legal-status contrast. The few mechanism-isolating studies identified so far point in a direction consistent with the Legal Last Mile hypothesis, but this is six non-random studies out of an eventual pool that has barely begun to be assembled, with no risk-of-bias screen applied to any of them. No pooled effect is estimated or implied anywhere in this document.</w:t>
+      </w:r>
+    </w:p>
+    <w:p>
+      <w:pPr>
+        <w:spacing w:after="160"/>
+      </w:pPr>
+      <w:r>
+        <w:rPr>
+          <w:rFonts w:ascii="Calibri" w:cs="Calibri" w:eastAsia="Calibri" w:hAnsi="Calibri"/>
+          <w:b/>
+          <w:bCs/>
+          <w:sz w:val="22"/>
+          <w:szCs w:val="22"/>
+        </w:rPr>
+        <w:t xml:space="preserve">This is a methods-and-status report with an explicitly exploratory, non-representative sketch attached — not a findings report.</w:t>
       </w:r>
     </w:p>
     <w:p>
@@ -5011,6 +5044,11 @@
       </w:r>
     </w:p>
     <w:p>
+      <w:r>
+        <w:br w:type="page"/>
+      </w:r>
+    </w:p>
+    <w:p>
       <w:pPr>
         <w:pStyle w:val="Heading1"/>
         <w:spacing w:after="160" w:before="320"/>
@@ -5021,7 +5059,1071 @@
           <w:b/>
           <w:bCs/>
         </w:rPr>
-        <w:t xml:space="preserve">6. Current Status by PRISMA Phase</w:t>
+        <w:t xml:space="preserve">6. Preliminary Results (Exploratory, Non-Representative)</w:t>
+      </w:r>
+    </w:p>
+    <w:tbl>
+      <w:tblPr>
+        <w:tblW w:type="pct" w:w="100%"/>
+        <w:tblBorders>
+          <w:top w:val="single" w:color="B08900" w:sz="12"/>
+          <w:left w:val="single" w:color="B08900" w:sz="12"/>
+          <w:bottom w:val="single" w:color="B08900" w:sz="12"/>
+          <w:right w:val="single" w:color="B08900" w:sz="12"/>
+          <w:insideH w:val="none"/>
+          <w:insideV w:val="none"/>
+        </w:tblBorders>
+      </w:tblPr>
+      <w:tblGrid>
+        <w:gridCol w:w="100"/>
+      </w:tblGrid>
+      <w:tr>
+        <w:tc>
+          <w:tcPr>
+            <w:shd w:fill="FFF8E1" w:val="clear"/>
+            <w:tcMar>
+              <w:top w:type="dxa" w:w="220"/>
+              <w:left w:type="dxa" w:w="260"/>
+              <w:bottom w:type="dxa" w:w="220"/>
+              <w:right w:type="dxa" w:w="260"/>
+            </w:tcMar>
+          </w:tcPr>
+          <w:p>
+            <w:pPr>
+              <w:spacing w:after="120"/>
+            </w:pPr>
+            <w:r>
+              <w:rPr>
+                <w:rFonts w:ascii="Calibri" w:cs="Calibri" w:eastAsia="Calibri" w:hAnsi="Calibri"/>
+                <w:b/>
+                <w:bCs/>
+                <w:color w:val="7A5C00"/>
+                <w:sz w:val="22"/>
+                <w:szCs w:val="22"/>
+              </w:rPr>
+              <w:t xml:space="preserve">Read this section as a sketch, not a finding.</w:t>
+            </w:r>
+          </w:p>
+          <w:p>
+            <w:pPr>
+              <w:spacing w:after="100"/>
+            </w:pPr>
+            <w:r>
+              <w:rPr>
+                <w:rFonts w:ascii="Calibri" w:cs="Calibri" w:eastAsia="Calibri" w:hAnsi="Calibri"/>
+                <w:sz w:val="21"/>
+                <w:szCs w:val="21"/>
+              </w:rPr>
+              <w:t xml:space="preserve">It exists because the researcher explicitly asked for one, not because the evidence base is ready to support it. The 85 studies behind it are ≈4.8% of the pool still to be screened, are not a random or representative draw from that pool, and have not been risk-of-bias appraised. Nothing below is a pooled estimate, and nothing below should be cited as this project's finding.</w:t>
+            </w:r>
+          </w:p>
+        </w:tc>
+      </w:tr>
+    </w:tbl>
+    <w:p>
+      <w:pPr>
+        <w:pStyle w:val="Heading2"/>
+        <w:spacing w:after="160" w:before="320"/>
+      </w:pPr>
+      <w:r>
+        <w:rPr>
+          <w:rFonts w:ascii="Calibri" w:cs="Calibri" w:eastAsia="Calibri" w:hAnsi="Calibri"/>
+          <w:b/>
+          <w:bCs/>
+        </w:rPr>
+        <w:t xml:space="preserve">6.1 What the 85 studies collectively look like</w:t>
+      </w:r>
+    </w:p>
+    <w:p>
+      <w:pPr>
+        <w:spacing w:after="160"/>
+      </w:pPr>
+      <w:r>
+        <w:rPr>
+          <w:rFonts w:ascii="Calibri" w:cs="Calibri" w:eastAsia="Calibri" w:hAnsi="Calibri"/>
+          <w:sz w:val="22"/>
+          <w:szCs w:val="22"/>
+        </w:rPr>
+        <w:t xml:space="preserve">The mechanism-family × outcome-family pattern already reported descriptively in §5.4–5.5 is the closest thing to a “result” that can honestly be drawn from a set this size and this incidentally assembled: 64 of 85 studies implicate more than one mechanism family at once, and the outcome mix leans slightly toward effective-access measures (35) over primary connection (34), with economic access (11) and administrative outcomes (5) less represented. That is a description of what has been coded so far, not a synthesized effect.</w:t>
+      </w:r>
+    </w:p>
+    <w:p>
+      <w:pPr>
+        <w:pStyle w:val="Heading2"/>
+        <w:spacing w:after="160" w:before="320"/>
+      </w:pPr>
+      <w:r>
+        <w:rPr>
+          <w:rFonts w:ascii="Calibri" w:cs="Calibri" w:eastAsia="Calibri" w:hAnsi="Calibri"/>
+          <w:b/>
+          <w:bCs/>
+        </w:rPr>
+        <w:t xml:space="preserve">6.2 Studies that isolate a legal/administrative mechanism</w:t>
+      </w:r>
+    </w:p>
+    <w:p>
+      <w:pPr>
+        <w:spacing w:after="160"/>
+      </w:pPr>
+      <w:r>
+        <w:rPr>
+          <w:rFonts w:ascii="Calibri" w:cs="Calibri" w:eastAsia="Calibri" w:hAnsi="Calibri"/>
+          <w:sz w:val="22"/>
+          <w:szCs w:val="22"/>
+        </w:rPr>
+        <w:t xml:space="preserve">Of the 37 studies flagged quantitative-synthesis-eligible at the individual-study level (§3.7), most report descriptive access or service statistics (coverage rates, water quantities, expenditure shares) without a comparison that isolates a legal or administrative condition as the exposure. Reading through all 37 (extraction_database.csv), a much smaller number — six — report a comparison that actually varies a legal or administrative condition against an access outcome:</w:t>
+      </w:r>
+    </w:p>
+    <w:tbl>
+      <w:tblPr>
+        <w:tblW w:type="dxa" w:w="9000"/>
+        <w:tblBorders>
+          <w:top w:val="single" w:color="auto" w:sz="4"/>
+          <w:left w:val="single" w:color="auto" w:sz="4"/>
+          <w:bottom w:val="single" w:color="auto" w:sz="4"/>
+          <w:right w:val="single" w:color="auto" w:sz="4"/>
+          <w:insideH w:val="single" w:color="auto" w:sz="4"/>
+          <w:insideV w:val="single" w:color="auto" w:sz="4"/>
+        </w:tblBorders>
+      </w:tblPr>
+      <w:tblGrid>
+        <w:gridCol w:w="2600"/>
+        <w:gridCol w:w="1900"/>
+        <w:gridCol w:w="2600"/>
+        <w:gridCol w:w="2900"/>
+      </w:tblGrid>
+      <w:tr>
+        <w:trPr>
+          <w:tblHeader/>
+        </w:trPr>
+        <w:tc>
+          <w:tcPr>
+            <w:tcW w:type="dxa" w:w="2600"/>
+            <w:shd w:fill="2F5496" w:val="clear"/>
+            <w:tcMar>
+              <w:top w:type="dxa" w:w="80"/>
+              <w:left w:type="dxa" w:w="100"/>
+              <w:bottom w:type="dxa" w:w="80"/>
+              <w:right w:type="dxa" w:w="100"/>
+            </w:tcMar>
+          </w:tcPr>
+          <w:p>
+            <w:r>
+              <w:rPr>
+                <w:rFonts w:ascii="Calibri" w:cs="Calibri" w:eastAsia="Calibri" w:hAnsi="Calibri"/>
+                <w:b/>
+                <w:bCs/>
+                <w:color w:val="FFFFFF"/>
+                <w:sz w:val="20"/>
+                <w:szCs w:val="20"/>
+              </w:rPr>
+              <w:t xml:space="preserve">Study</w:t>
+            </w:r>
+          </w:p>
+        </w:tc>
+        <w:tc>
+          <w:tcPr>
+            <w:tcW w:type="dxa" w:w="1900"/>
+            <w:shd w:fill="2F5496" w:val="clear"/>
+            <w:tcMar>
+              <w:top w:type="dxa" w:w="80"/>
+              <w:left w:type="dxa" w:w="100"/>
+              <w:bottom w:type="dxa" w:w="80"/>
+              <w:right w:type="dxa" w:w="100"/>
+            </w:tcMar>
+          </w:tcPr>
+          <w:p>
+            <w:r>
+              <w:rPr>
+                <w:rFonts w:ascii="Calibri" w:cs="Calibri" w:eastAsia="Calibri" w:hAnsi="Calibri"/>
+                <w:b/>
+                <w:bCs/>
+                <w:color w:val="FFFFFF"/>
+                <w:sz w:val="20"/>
+                <w:szCs w:val="20"/>
+              </w:rPr>
+              <w:t xml:space="preserve">Mechanism</w:t>
+            </w:r>
+          </w:p>
+        </w:tc>
+        <w:tc>
+          <w:tcPr>
+            <w:tcW w:type="dxa" w:w="2600"/>
+            <w:shd w:fill="2F5496" w:val="clear"/>
+            <w:tcMar>
+              <w:top w:type="dxa" w:w="80"/>
+              <w:left w:type="dxa" w:w="100"/>
+              <w:bottom w:type="dxa" w:w="80"/>
+              <w:right w:type="dxa" w:w="100"/>
+            </w:tcMar>
+          </w:tcPr>
+          <w:p>
+            <w:r>
+              <w:rPr>
+                <w:rFonts w:ascii="Calibri" w:cs="Calibri" w:eastAsia="Calibri" w:hAnsi="Calibri"/>
+                <w:b/>
+                <w:bCs/>
+                <w:color w:val="FFFFFF"/>
+                <w:sz w:val="20"/>
+                <w:szCs w:val="20"/>
+              </w:rPr>
+              <w:t xml:space="preserve">Comparison</w:t>
+            </w:r>
+          </w:p>
+        </w:tc>
+        <w:tc>
+          <w:tcPr>
+            <w:tcW w:type="dxa" w:w="2900"/>
+            <w:shd w:fill="2F5496" w:val="clear"/>
+            <w:tcMar>
+              <w:top w:type="dxa" w:w="80"/>
+              <w:left w:type="dxa" w:w="100"/>
+              <w:bottom w:type="dxa" w:w="80"/>
+              <w:right w:type="dxa" w:w="100"/>
+            </w:tcMar>
+          </w:tcPr>
+          <w:p>
+            <w:r>
+              <w:rPr>
+                <w:rFonts w:ascii="Calibri" w:cs="Calibri" w:eastAsia="Calibri" w:hAnsi="Calibri"/>
+                <w:b/>
+                <w:bCs/>
+                <w:color w:val="FFFFFF"/>
+                <w:sz w:val="20"/>
+                <w:szCs w:val="20"/>
+              </w:rPr>
+              <w:t xml:space="preserve">Reported result</w:t>
+            </w:r>
+          </w:p>
+        </w:tc>
+      </w:tr>
+      <w:tr>
+        <w:tc>
+          <w:tcPr>
+            <w:tcW w:type="dxa" w:w="2600"/>
+            <w:tcMar>
+              <w:top w:type="dxa" w:w="80"/>
+              <w:left w:type="dxa" w:w="100"/>
+              <w:bottom w:type="dxa" w:w="80"/>
+              <w:right w:type="dxa" w:w="100"/>
+            </w:tcMar>
+          </w:tcPr>
+          <w:p>
+            <w:r>
+              <w:rPr>
+                <w:rFonts w:ascii="Calibri" w:cs="Calibri" w:eastAsia="Calibri" w:hAnsi="Calibri"/>
+                <w:sz w:val="20"/>
+                <w:szCs w:val="20"/>
+              </w:rPr>
+              <w:t xml:space="preserve">Lubeck-Schricker et al. 2023 (S084)</w:t>
+            </w:r>
+          </w:p>
+        </w:tc>
+        <w:tc>
+          <w:tcPr>
+            <w:tcW w:type="dxa" w:w="1900"/>
+            <w:tcMar>
+              <w:top w:type="dxa" w:w="80"/>
+              <w:left w:type="dxa" w:w="100"/>
+              <w:bottom w:type="dxa" w:w="80"/>
+              <w:right w:type="dxa" w:w="100"/>
+            </w:tcMar>
+          </w:tcPr>
+          <w:p>
+            <w:r>
+              <w:rPr>
+                <w:rFonts w:ascii="Calibri" w:cs="Calibri" w:eastAsia="Calibri" w:hAnsi="Calibri"/>
+                <w:sz w:val="20"/>
+                <w:szCs w:val="20"/>
+              </w:rPr>
+              <w:t xml:space="preserve">Eligibility (legal notification)</w:t>
+            </w:r>
+          </w:p>
+        </w:tc>
+        <w:tc>
+          <w:tcPr>
+            <w:tcW w:type="dxa" w:w="2600"/>
+            <w:tcMar>
+              <w:top w:type="dxa" w:w="80"/>
+              <w:left w:type="dxa" w:w="100"/>
+              <w:bottom w:type="dxa" w:w="80"/>
+              <w:right w:type="dxa" w:w="100"/>
+            </w:tcMar>
+          </w:tcPr>
+          <w:p>
+            <w:r>
+              <w:rPr>
+                <w:rFonts w:ascii="Calibri" w:cs="Calibri" w:eastAsia="Calibri" w:hAnsi="Calibri"/>
+                <w:sz w:val="20"/>
+                <w:szCs w:val="20"/>
+              </w:rPr>
+              <w:t xml:space="preserve">Notified vs. non-notified households, same Mumbai slum</w:t>
+            </w:r>
+          </w:p>
+        </w:tc>
+        <w:tc>
+          <w:tcPr>
+            <w:tcW w:type="dxa" w:w="2900"/>
+            <w:tcMar>
+              <w:top w:type="dxa" w:w="80"/>
+              <w:left w:type="dxa" w:w="100"/>
+              <w:bottom w:type="dxa" w:w="80"/>
+              <w:right w:type="dxa" w:w="100"/>
+            </w:tcMar>
+          </w:tcPr>
+          <w:p>
+            <w:r>
+              <w:rPr>
+                <w:rFonts w:ascii="Calibri" w:cs="Calibri" w:eastAsia="Calibri" w:hAnsi="Calibri"/>
+                <w:sz w:val="20"/>
+                <w:szCs w:val="20"/>
+              </w:rPr>
+              <w:t xml:space="preserve">Non-notified households used 37.3% less water per capita/day (adjusted, p&lt;0.001)</w:t>
+            </w:r>
+          </w:p>
+        </w:tc>
+      </w:tr>
+      <w:tr>
+        <w:tc>
+          <w:tcPr>
+            <w:tcW w:type="dxa" w:w="2600"/>
+            <w:tcMar>
+              <w:top w:type="dxa" w:w="80"/>
+              <w:left w:type="dxa" w:w="100"/>
+              <w:bottom w:type="dxa" w:w="80"/>
+              <w:right w:type="dxa" w:w="100"/>
+            </w:tcMar>
+          </w:tcPr>
+          <w:p>
+            <w:r>
+              <w:rPr>
+                <w:rFonts w:ascii="Calibri" w:cs="Calibri" w:eastAsia="Calibri" w:hAnsi="Calibri"/>
+                <w:sz w:val="20"/>
+                <w:szCs w:val="20"/>
+              </w:rPr>
+              <w:t xml:space="preserve">Gaikwad &amp; Thomas 2026 (S085)</w:t>
+            </w:r>
+          </w:p>
+        </w:tc>
+        <w:tc>
+          <w:tcPr>
+            <w:tcW w:type="dxa" w:w="1900"/>
+            <w:tcMar>
+              <w:top w:type="dxa" w:w="80"/>
+              <w:left w:type="dxa" w:w="100"/>
+              <w:bottom w:type="dxa" w:w="80"/>
+              <w:right w:type="dxa" w:w="100"/>
+            </w:tcMar>
+          </w:tcPr>
+          <w:p>
+            <w:r>
+              <w:rPr>
+                <w:rFonts w:ascii="Calibri" w:cs="Calibri" w:eastAsia="Calibri" w:hAnsi="Calibri"/>
+                <w:sz w:val="20"/>
+                <w:szCs w:val="20"/>
+              </w:rPr>
+              <w:t xml:space="preserve">Burden × Discretion/Accommodation</w:t>
+            </w:r>
+          </w:p>
+        </w:tc>
+        <w:tc>
+          <w:tcPr>
+            <w:tcW w:type="dxa" w:w="2600"/>
+            <w:tcMar>
+              <w:top w:type="dxa" w:w="80"/>
+              <w:left w:type="dxa" w:w="100"/>
+              <w:bottom w:type="dxa" w:w="80"/>
+              <w:right w:type="dxa" w:w="100"/>
+            </w:tcMar>
+          </w:tcPr>
+          <w:p>
+            <w:r>
+              <w:rPr>
+                <w:rFonts w:ascii="Calibri" w:cs="Calibri" w:eastAsia="Calibri" w:hAnsi="Calibri"/>
+                <w:sz w:val="20"/>
+                <w:szCs w:val="20"/>
+              </w:rPr>
+              <w:t xml:space="preserve">Bureaucratic assistance alone vs. combined with political coordination (cluster-RCT)</w:t>
+            </w:r>
+          </w:p>
+        </w:tc>
+        <w:tc>
+          <w:tcPr>
+            <w:tcW w:type="dxa" w:w="2900"/>
+            <w:tcMar>
+              <w:top w:type="dxa" w:w="80"/>
+              <w:left w:type="dxa" w:w="100"/>
+              <w:bottom w:type="dxa" w:w="80"/>
+              <w:right w:type="dxa" w:w="100"/>
+            </w:tcMar>
+          </w:tcPr>
+          <w:p>
+            <w:r>
+              <w:rPr>
+                <w:rFonts w:ascii="Calibri" w:cs="Calibri" w:eastAsia="Calibri" w:hAnsi="Calibri"/>
+                <w:sz w:val="20"/>
+                <w:szCs w:val="20"/>
+              </w:rPr>
+              <w:t xml:space="preserve">Combined treatment raised full formalization by 19 points (p=.001); interaction term p=.04. Assistance alone raised applications but not full formalization</w:t>
+            </w:r>
+          </w:p>
+        </w:tc>
+      </w:tr>
+      <w:tr>
+        <w:tc>
+          <w:tcPr>
+            <w:tcW w:type="dxa" w:w="2600"/>
+            <w:tcMar>
+              <w:top w:type="dxa" w:w="80"/>
+              <w:left w:type="dxa" w:w="100"/>
+              <w:bottom w:type="dxa" w:w="80"/>
+              <w:right w:type="dxa" w:w="100"/>
+            </w:tcMar>
+          </w:tcPr>
+          <w:p>
+            <w:r>
+              <w:rPr>
+                <w:rFonts w:ascii="Calibri" w:cs="Calibri" w:eastAsia="Calibri" w:hAnsi="Calibri"/>
+                <w:sz w:val="20"/>
+                <w:szCs w:val="20"/>
+              </w:rPr>
+              <w:t xml:space="preserve">Filčák &amp; Škobla 2021 (S078)</w:t>
+            </w:r>
+          </w:p>
+        </w:tc>
+        <w:tc>
+          <w:tcPr>
+            <w:tcW w:type="dxa" w:w="1900"/>
+            <w:tcMar>
+              <w:top w:type="dxa" w:w="80"/>
+              <w:left w:type="dxa" w:w="100"/>
+              <w:bottom w:type="dxa" w:w="80"/>
+              <w:right w:type="dxa" w:w="100"/>
+            </w:tcMar>
+          </w:tcPr>
+          <w:p>
+            <w:r>
+              <w:rPr>
+                <w:rFonts w:ascii="Calibri" w:cs="Calibri" w:eastAsia="Calibri" w:hAnsi="Calibri"/>
+                <w:sz w:val="20"/>
+                <w:szCs w:val="20"/>
+              </w:rPr>
+              <w:t xml:space="preserve">Discretion/Accommodation</w:t>
+            </w:r>
+          </w:p>
+        </w:tc>
+        <w:tc>
+          <w:tcPr>
+            <w:tcW w:type="dxa" w:w="2600"/>
+            <w:tcMar>
+              <w:top w:type="dxa" w:w="80"/>
+              <w:left w:type="dxa" w:w="100"/>
+              <w:bottom w:type="dxa" w:w="80"/>
+              <w:right w:type="dxa" w:w="100"/>
+            </w:tcMar>
+          </w:tcPr>
+          <w:p>
+            <w:r>
+              <w:rPr>
+                <w:rFonts w:ascii="Calibri" w:cs="Calibri" w:eastAsia="Calibri" w:hAnsi="Calibri"/>
+                <w:sz w:val="20"/>
+                <w:szCs w:val="20"/>
+              </w:rPr>
+              <w:t xml:space="preserve">Potential vs. actual service uptake, Roma settlements, Slovakia</w:t>
+            </w:r>
+          </w:p>
+        </w:tc>
+        <w:tc>
+          <w:tcPr>
+            <w:tcW w:type="dxa" w:w="2900"/>
+            <w:tcMar>
+              <w:top w:type="dxa" w:w="80"/>
+              <w:left w:type="dxa" w:w="100"/>
+              <w:bottom w:type="dxa" w:w="80"/>
+              <w:right w:type="dxa" w:w="100"/>
+            </w:tcMar>
+          </w:tcPr>
+          <w:p>
+            <w:r>
+              <w:rPr>
+                <w:rFonts w:ascii="Calibri" w:cs="Calibri" w:eastAsia="Calibri" w:hAnsi="Calibri"/>
+                <w:sz w:val="20"/>
+                <w:szCs w:val="20"/>
+              </w:rPr>
+              <w:t xml:space="preserve">76% had potential water access but only 59% actually connected; 51% potential sewerage vs. 35% actual</w:t>
+            </w:r>
+          </w:p>
+        </w:tc>
+      </w:tr>
+      <w:tr>
+        <w:tc>
+          <w:tcPr>
+            <w:tcW w:type="dxa" w:w="2600"/>
+            <w:tcMar>
+              <w:top w:type="dxa" w:w="80"/>
+              <w:left w:type="dxa" w:w="100"/>
+              <w:bottom w:type="dxa" w:w="80"/>
+              <w:right w:type="dxa" w:w="100"/>
+            </w:tcMar>
+          </w:tcPr>
+          <w:p>
+            <w:r>
+              <w:rPr>
+                <w:rFonts w:ascii="Calibri" w:cs="Calibri" w:eastAsia="Calibri" w:hAnsi="Calibri"/>
+                <w:sz w:val="20"/>
+                <w:szCs w:val="20"/>
+              </w:rPr>
+              <w:t xml:space="preserve">Kozole et al. 2023 (S057)</w:t>
+            </w:r>
+          </w:p>
+        </w:tc>
+        <w:tc>
+          <w:tcPr>
+            <w:tcW w:type="dxa" w:w="1900"/>
+            <w:tcMar>
+              <w:top w:type="dxa" w:w="80"/>
+              <w:left w:type="dxa" w:w="100"/>
+              <w:bottom w:type="dxa" w:w="80"/>
+              <w:right w:type="dxa" w:w="100"/>
+            </w:tcMar>
+          </w:tcPr>
+          <w:p>
+            <w:r>
+              <w:rPr>
+                <w:rFonts w:ascii="Calibri" w:cs="Calibri" w:eastAsia="Calibri" w:hAnsi="Calibri"/>
+                <w:sz w:val="20"/>
+                <w:szCs w:val="20"/>
+              </w:rPr>
+              <w:t xml:space="preserve">Burden (subsidy easing eligibility cost)</w:t>
+            </w:r>
+          </w:p>
+        </w:tc>
+        <w:tc>
+          <w:tcPr>
+            <w:tcW w:type="dxa" w:w="2600"/>
+            <w:tcMar>
+              <w:top w:type="dxa" w:w="80"/>
+              <w:left w:type="dxa" w:w="100"/>
+              <w:bottom w:type="dxa" w:w="80"/>
+              <w:right w:type="dxa" w:w="100"/>
+            </w:tcMar>
+          </w:tcPr>
+          <w:p>
+            <w:r>
+              <w:rPr>
+                <w:rFonts w:ascii="Calibri" w:cs="Calibri" w:eastAsia="Calibri" w:hAnsi="Calibri"/>
+                <w:sz w:val="20"/>
+                <w:szCs w:val="20"/>
+              </w:rPr>
+              <w:t xml:space="preserve">Subsidy-eligible vs. ineligible households (cluster-RCT), rural Cambodia</w:t>
+            </w:r>
+          </w:p>
+        </w:tc>
+        <w:tc>
+          <w:tcPr>
+            <w:tcW w:type="dxa" w:w="2900"/>
+            <w:tcMar>
+              <w:top w:type="dxa" w:w="80"/>
+              <w:left w:type="dxa" w:w="100"/>
+              <w:bottom w:type="dxa" w:w="80"/>
+              <w:right w:type="dxa" w:w="100"/>
+            </w:tcMar>
+          </w:tcPr>
+          <w:p>
+            <w:r>
+              <w:rPr>
+                <w:rFonts w:ascii="Calibri" w:cs="Calibri" w:eastAsia="Calibri" w:hAnsi="Calibri"/>
+                <w:sz w:val="20"/>
+                <w:szCs w:val="20"/>
+              </w:rPr>
+              <w:t xml:space="preserve">Subsidy offer raised latrine-purchase likelihood by 32 percentage points</w:t>
+            </w:r>
+          </w:p>
+        </w:tc>
+      </w:tr>
+      <w:tr>
+        <w:tc>
+          <w:tcPr>
+            <w:tcW w:type="dxa" w:w="2600"/>
+            <w:tcMar>
+              <w:top w:type="dxa" w:w="80"/>
+              <w:left w:type="dxa" w:w="100"/>
+              <w:bottom w:type="dxa" w:w="80"/>
+              <w:right w:type="dxa" w:w="100"/>
+            </w:tcMar>
+          </w:tcPr>
+          <w:p>
+            <w:r>
+              <w:rPr>
+                <w:rFonts w:ascii="Calibri" w:cs="Calibri" w:eastAsia="Calibri" w:hAnsi="Calibri"/>
+                <w:sz w:val="20"/>
+                <w:szCs w:val="20"/>
+              </w:rPr>
+              <w:t xml:space="preserve">dos Santos Alves Romanato et al. 2025 (S021)</w:t>
+            </w:r>
+          </w:p>
+        </w:tc>
+        <w:tc>
+          <w:tcPr>
+            <w:tcW w:type="dxa" w:w="1900"/>
+            <w:tcMar>
+              <w:top w:type="dxa" w:w="80"/>
+              <w:left w:type="dxa" w:w="100"/>
+              <w:bottom w:type="dxa" w:w="80"/>
+              <w:right w:type="dxa" w:w="100"/>
+            </w:tcMar>
+          </w:tcPr>
+          <w:p>
+            <w:r>
+              <w:rPr>
+                <w:rFonts w:ascii="Calibri" w:cs="Calibri" w:eastAsia="Calibri" w:hAnsi="Calibri"/>
+                <w:sz w:val="20"/>
+                <w:szCs w:val="20"/>
+              </w:rPr>
+              <w:t xml:space="preserve">Enforcement</w:t>
+            </w:r>
+          </w:p>
+        </w:tc>
+        <w:tc>
+          <w:tcPr>
+            <w:tcW w:type="dxa" w:w="2600"/>
+            <w:tcMar>
+              <w:top w:type="dxa" w:w="80"/>
+              <w:left w:type="dxa" w:w="100"/>
+              <w:bottom w:type="dxa" w:w="80"/>
+              <w:right w:type="dxa" w:w="100"/>
+            </w:tcMar>
+          </w:tcPr>
+          <w:p>
+            <w:r>
+              <w:rPr>
+                <w:rFonts w:ascii="Calibri" w:cs="Calibri" w:eastAsia="Calibri" w:hAnsi="Calibri"/>
+                <w:sz w:val="20"/>
+                <w:szCs w:val="20"/>
+              </w:rPr>
+              <w:t xml:space="preserve">Complaints filed vs. resolved within regulatory timeframe, Natal, Brazil</w:t>
+            </w:r>
+          </w:p>
+        </w:tc>
+        <w:tc>
+          <w:tcPr>
+            <w:tcW w:type="dxa" w:w="2900"/>
+            <w:tcMar>
+              <w:top w:type="dxa" w:w="80"/>
+              <w:left w:type="dxa" w:w="100"/>
+              <w:bottom w:type="dxa" w:w="80"/>
+              <w:right w:type="dxa" w:w="100"/>
+            </w:tcMar>
+          </w:tcPr>
+          <w:p>
+            <w:r>
+              <w:rPr>
+                <w:rFonts w:ascii="Calibri" w:cs="Calibri" w:eastAsia="Calibri" w:hAnsi="Calibri"/>
+                <w:sz w:val="20"/>
+                <w:szCs w:val="20"/>
+              </w:rPr>
+              <w:t xml:space="preserve">67% of water-shortage complaints unresolved within the regulatory window</w:t>
+            </w:r>
+          </w:p>
+        </w:tc>
+      </w:tr>
+      <w:tr>
+        <w:tc>
+          <w:tcPr>
+            <w:tcW w:type="dxa" w:w="2600"/>
+            <w:tcMar>
+              <w:top w:type="dxa" w:w="80"/>
+              <w:left w:type="dxa" w:w="100"/>
+              <w:bottom w:type="dxa" w:w="80"/>
+              <w:right w:type="dxa" w:w="100"/>
+            </w:tcMar>
+          </w:tcPr>
+          <w:p>
+            <w:r>
+              <w:rPr>
+                <w:rFonts w:ascii="Calibri" w:cs="Calibri" w:eastAsia="Calibri" w:hAnsi="Calibri"/>
+                <w:sz w:val="20"/>
+                <w:szCs w:val="20"/>
+              </w:rPr>
+              <w:t xml:space="preserve">Rajput &amp; Pu 2025 (S029)</w:t>
+            </w:r>
+          </w:p>
+        </w:tc>
+        <w:tc>
+          <w:tcPr>
+            <w:tcW w:type="dxa" w:w="1900"/>
+            <w:tcMar>
+              <w:top w:type="dxa" w:w="80"/>
+              <w:left w:type="dxa" w:w="100"/>
+              <w:bottom w:type="dxa" w:w="80"/>
+              <w:right w:type="dxa" w:w="100"/>
+            </w:tcMar>
+          </w:tcPr>
+          <w:p>
+            <w:r>
+              <w:rPr>
+                <w:rFonts w:ascii="Calibri" w:cs="Calibri" w:eastAsia="Calibri" w:hAnsi="Calibri"/>
+                <w:sz w:val="20"/>
+                <w:szCs w:val="20"/>
+              </w:rPr>
+              <w:t xml:space="preserve">Eligibility/Burden</w:t>
+            </w:r>
+          </w:p>
+        </w:tc>
+        <w:tc>
+          <w:tcPr>
+            <w:tcW w:type="dxa" w:w="2600"/>
+            <w:tcMar>
+              <w:top w:type="dxa" w:w="80"/>
+              <w:left w:type="dxa" w:w="100"/>
+              <w:bottom w:type="dxa" w:w="80"/>
+              <w:right w:type="dxa" w:w="100"/>
+            </w:tcMar>
+          </w:tcPr>
+          <w:p>
+            <w:r>
+              <w:rPr>
+                <w:rFonts w:ascii="Calibri" w:cs="Calibri" w:eastAsia="Calibri" w:hAnsi="Calibri"/>
+                <w:sz w:val="20"/>
+                <w:szCs w:val="20"/>
+              </w:rPr>
+              <w:t xml:space="preserve">Utility-reported connections vs. independent household survey, Bodh Gaya, India</w:t>
+            </w:r>
+          </w:p>
+        </w:tc>
+        <w:tc>
+          <w:tcPr>
+            <w:tcW w:type="dxa" w:w="2900"/>
+            <w:tcMar>
+              <w:top w:type="dxa" w:w="80"/>
+              <w:left w:type="dxa" w:w="100"/>
+              <w:bottom w:type="dxa" w:w="80"/>
+              <w:right w:type="dxa" w:w="100"/>
+            </w:tcMar>
+          </w:tcPr>
+          <w:p>
+            <w:r>
+              <w:rPr>
+                <w:rFonts w:ascii="Calibri" w:cs="Calibri" w:eastAsia="Calibri" w:hAnsi="Calibri"/>
+                <w:sz w:val="20"/>
+                <w:szCs w:val="20"/>
+              </w:rPr>
+              <w:t xml:space="preserve">Utility reported 3,900/6,000 targeted connections; independent survey found only 9.4% of households actually piped</w:t>
+            </w:r>
+          </w:p>
+        </w:tc>
+      </w:tr>
+    </w:tbl>
+    <w:p>
+      <w:pPr>
+        <w:spacing w:after="160"/>
+      </w:pPr>
+    </w:p>
+    <w:p>
+      <w:pPr>
+        <w:spacing w:after="160"/>
+      </w:pPr>
+      <w:r>
+        <w:rPr>
+          <w:rFonts w:ascii="Calibri" w:cs="Calibri" w:eastAsia="Calibri" w:hAnsi="Calibri"/>
+          <w:sz w:val="22"/>
+          <w:szCs w:val="22"/>
+        </w:rPr>
+        <w:t xml:space="preserve">All six point in the direction this review's framework would predict — legal or administrative status/process shaping access net of physical proximity — but they are six studies, in six different countries, using six different designs and outcome measures, extracted from a pool that is currently 4.8% screened. This is not a synthesis; it is a list of the current evidence base's most mechanism-relevant examples, assembled by hand-reading extraction notes, not by a pre-specified selection rule.</w:t>
+      </w:r>
+    </w:p>
+    <w:p>
+      <w:pPr>
+        <w:pStyle w:val="Heading2"/>
+        <w:spacing w:after="160" w:before="320"/>
+      </w:pPr>
+      <w:r>
+        <w:rPr>
+          <w:rFonts w:ascii="Calibri" w:cs="Calibri" w:eastAsia="Calibri" w:hAnsi="Calibri"/>
+          <w:b/>
+          <w:bCs/>
+        </w:rPr>
+        <w:t xml:space="preserve">6.3 Candidate synthesis families, revisited against actual counts</w:t>
+      </w:r>
+    </w:p>
+    <w:p>
+      <w:pPr>
+        <w:spacing w:after="160"/>
+      </w:pPr>
+      <w:r>
+        <w:rPr>
+          <w:rFonts w:ascii="Calibri" w:cs="Calibri" w:eastAsia="Calibri" w:hAnsi="Calibri"/>
+          <w:sz w:val="22"/>
+          <w:szCs w:val="22"/>
+        </w:rPr>
+        <w:t xml:space="preserve">PROJECT_SPEC.md §8 pre-specified three candidate families to test for poolability. Against the studies actually in hand:</w:t>
+      </w:r>
+    </w:p>
+    <w:p>
+      <w:pPr>
+        <w:pStyle w:val="ListParagraph"/>
+        <w:numPr>
+          <w:ilvl w:val="0"/>
+          <w:numId w:val="1"/>
+        </w:numPr>
+        <w:spacing w:after="100"/>
+      </w:pPr>
+      <w:r>
+        <w:rPr>
+          <w:rFonts w:ascii="Calibri" w:cs="Calibri" w:eastAsia="Calibri" w:hAnsi="Calibri"/>
+          <w:b/>
+          <w:bCs/>
+          <w:sz w:val="22"/>
+          <w:szCs w:val="22"/>
+        </w:rPr>
+        <w:t xml:space="preserve">Family A</w:t>
+      </w:r>
+      <w:r>
+        <w:rPr>
+          <w:rFonts w:ascii="Calibri" w:cs="Calibri" w:eastAsia="Calibri" w:hAnsi="Calibri"/>
+          <w:sz w:val="22"/>
+          <w:szCs w:val="22"/>
+        </w:rPr>
+        <w:t xml:space="preserve"> (legal recognition → access): one clearly on-point study (S084). Not poolable by any standard — a single study has no basis for a pooled estimate.</w:t>
+      </w:r>
+    </w:p>
+    <w:p>
+      <w:pPr>
+        <w:pStyle w:val="ListParagraph"/>
+        <w:numPr>
+          <w:ilvl w:val="0"/>
+          <w:numId w:val="1"/>
+        </w:numPr>
+        <w:spacing w:after="100"/>
+      </w:pPr>
+      <w:r>
+        <w:rPr>
+          <w:rFonts w:ascii="Calibri" w:cs="Calibri" w:eastAsia="Calibri" w:hAnsi="Calibri"/>
+          <w:b/>
+          <w:bCs/>
+          <w:sz w:val="22"/>
+          <w:szCs w:val="22"/>
+        </w:rPr>
+        <w:t xml:space="preserve">Family B</w:t>
+      </w:r>
+      <w:r>
+        <w:rPr>
+          <w:rFonts w:ascii="Calibri" w:cs="Calibri" w:eastAsia="Calibri" w:hAnsi="Calibri"/>
+          <w:sz w:val="22"/>
+          <w:szCs w:val="22"/>
+        </w:rPr>
+        <w:t xml:space="preserve"> (bureaucratic assistance → connection): one clearly on-point study (S085), possibly a second if S029's utility-vs-independent-survey discrepancy is read as an assistance/administrative-capacity story. Same conclusion: not poolable yet.</w:t>
+      </w:r>
+    </w:p>
+    <w:p>
+      <w:pPr>
+        <w:pStyle w:val="ListParagraph"/>
+        <w:numPr>
+          <w:ilvl w:val="0"/>
+          <w:numId w:val="1"/>
+        </w:numPr>
+        <w:spacing w:after="100"/>
+      </w:pPr>
+      <w:r>
+        <w:rPr>
+          <w:rFonts w:ascii="Calibri" w:cs="Calibri" w:eastAsia="Calibri" w:hAnsi="Calibri"/>
+          <w:b/>
+          <w:bCs/>
+          <w:sz w:val="22"/>
+          <w:szCs w:val="22"/>
+        </w:rPr>
+        <w:t xml:space="preserve">Family C</w:t>
+      </w:r>
+      <w:r>
+        <w:rPr>
+          <w:rFonts w:ascii="Calibri" w:cs="Calibri" w:eastAsia="Calibri" w:hAnsi="Calibri"/>
+          <w:sz w:val="22"/>
+          <w:szCs w:val="22"/>
+        </w:rPr>
+        <w:t xml:space="preserve"> (legal/administrative barriers → unequal access): the broadest and most heterogeneous of the three, plausibly touched by all six studies above plus much of the “multiple mechanisms” majority (§6.1) — but heterogeneous enough in outcome and design that ANALYSIS_PLAN.md §2's own decision tree would very likely route it to structured narrative synthesis (SWiM) rather than meta-analysis even once screening is complete.</w:t>
+      </w:r>
+    </w:p>
+    <w:p>
+      <w:pPr>
+        <w:spacing w:after="160"/>
+      </w:pPr>
+      <w:r>
+        <w:rPr>
+          <w:rFonts w:ascii="Calibri" w:cs="Calibri" w:eastAsia="Calibri" w:hAnsi="Calibri"/>
+          <w:sz w:val="22"/>
+          <w:szCs w:val="22"/>
+        </w:rPr>
+        <w:t xml:space="preserve">Running ANALYSIS_PLAN.md's decision tree formally (Phase 11) against the current 85 studies would almost certainly conclude “insufficient independent studies” for Families A and B and “excessive heterogeneity” for Family C. That is an expected, not a discouraging, result at 4.8% screening progress — it says more about how early this snapshot is than about whether pooling will ultimately be justified.</w:t>
+      </w:r>
+    </w:p>
+    <w:p>
+      <w:pPr>
+        <w:pStyle w:val="Heading1"/>
+        <w:spacing w:after="160" w:before="320"/>
+      </w:pPr>
+      <w:r>
+        <w:rPr>
+          <w:rFonts w:ascii="Calibri" w:cs="Calibri" w:eastAsia="Calibri" w:hAnsi="Calibri"/>
+          <w:b/>
+          <w:bCs/>
+        </w:rPr>
+        <w:t xml:space="preserve">7. Preliminary Discussion (Exploratory)</w:t>
+      </w:r>
+    </w:p>
+    <w:p>
+      <w:pPr>
+        <w:spacing w:after="160"/>
+      </w:pPr>
+      <w:r>
+        <w:rPr>
+          <w:rFonts w:ascii="Calibri" w:cs="Calibri" w:eastAsia="Calibri" w:hAnsi="Calibri"/>
+          <w:i/>
+          <w:iCs/>
+          <w:sz w:val="22"/>
+          <w:szCs w:val="22"/>
+        </w:rPr>
+        <w:t xml:space="preserve">Same caveat as §6: exploratory reading of a small, non-representative, risk-of-bias-unscreened sample. Treat as hypothesis-generating, not hypothesis-confirming.</w:t>
+      </w:r>
+    </w:p>
+    <w:p>
+      <w:pPr>
+        <w:spacing w:after="160"/>
+      </w:pPr>
+      <w:r>
+        <w:rPr>
+          <w:rFonts w:ascii="Calibri" w:cs="Calibri" w:eastAsia="Calibri" w:hAnsi="Calibri"/>
+          <w:sz w:val="22"/>
+          <w:szCs w:val="22"/>
+        </w:rPr>
+        <w:t xml:space="preserve">The pattern in §6.2, thin as it is, is at least consistent with the Legal Last Mile framework: in every one of the six mechanism-isolating studies found so far, a legal or administrative condition — notification status, combined bureaucratic/political pressure, actual vs. nominal service entitlement, subsidy eligibility, complaint enforcement, or the gap between utility records and household-reported connection — tracked with the access outcome in the predicted direction. None of the six studies found so far contradicts the framework. That is a weak form of support: absence of disconfirming evidence in six hand-selected studies is a long way from evidence the framework survives serious testing.</w:t>
+      </w:r>
+    </w:p>
+    <w:p>
+      <w:pPr>
+        <w:spacing w:after="160"/>
+      </w:pPr>
+      <w:r>
+        <w:rPr>
+          <w:rFonts w:ascii="Calibri" w:cs="Calibri" w:eastAsia="Calibri" w:hAnsi="Calibri"/>
+          <w:sz w:val="22"/>
+          <w:szCs w:val="22"/>
+        </w:rPr>
+        <w:t xml:space="preserve">Two patterns are worth flagging as things to watch as screening continues, without treating either as established:</w:t>
+      </w:r>
+    </w:p>
+    <w:p>
+      <w:pPr>
+        <w:pStyle w:val="ListParagraph"/>
+        <w:numPr>
+          <w:ilvl w:val="0"/>
+          <w:numId w:val="1"/>
+        </w:numPr>
+        <w:spacing w:after="100"/>
+      </w:pPr>
+      <w:r>
+        <w:rPr>
+          <w:rFonts w:ascii="Calibri" w:cs="Calibri" w:eastAsia="Calibri" w:hAnsi="Calibri"/>
+          <w:b/>
+          <w:bCs/>
+          <w:sz w:val="22"/>
+          <w:szCs w:val="22"/>
+        </w:rPr>
+        <w:t xml:space="preserve">Mechanisms may bundle rather than operate independently.</w:t>
+      </w:r>
+      <w:r>
+        <w:rPr>
+          <w:rFonts w:ascii="Calibri" w:cs="Calibri" w:eastAsia="Calibri" w:hAnsi="Calibri"/>
+          <w:sz w:val="22"/>
+          <w:szCs w:val="22"/>
+        </w:rPr>
+        <w:t xml:space="preserve"> Gaikwad &amp; Thomas (2026) find bureaucratic assistance alone insufficient — only the combination with political coordination produced an effect — and 64 of 85 studies overall (§5.4, §6.1) code more than one mechanism family simultaneously. If this holds up as screening continues, it would argue against treating ELIGIBILITY, BURDEN, DISCRETION_ACCOMMODATION, and ENFORCEMENT as separable exposures in eventual synthesis, and toward modeling them as an interacting bundle — a genuinely open question for ANALYSIS_PLAN.md, not something the current data settles.</w:t>
+      </w:r>
+    </w:p>
+    <w:p>
+      <w:pPr>
+        <w:pStyle w:val="ListParagraph"/>
+        <w:numPr>
+          <w:ilvl w:val="0"/>
+          <w:numId w:val="1"/>
+        </w:numPr>
+        <w:spacing w:after="100"/>
+      </w:pPr>
+      <w:r>
+        <w:rPr>
+          <w:rFonts w:ascii="Calibri" w:cs="Calibri" w:eastAsia="Calibri" w:hAnsi="Calibri"/>
+          <w:b/>
+          <w:bCs/>
+          <w:sz w:val="22"/>
+          <w:szCs w:val="22"/>
+        </w:rPr>
+        <w:t xml:space="preserve">The gap between nominal and actual access recurs.</w:t>
+      </w:r>
+      <w:r>
+        <w:rPr>
+          <w:rFonts w:ascii="Calibri" w:cs="Calibri" w:eastAsia="Calibri" w:hAnsi="Calibri"/>
+          <w:sz w:val="22"/>
+          <w:szCs w:val="22"/>
+        </w:rPr>
+        <w:t xml:space="preserve"> Filčák &amp; Škobla (Roma settlements) and Rajput &amp; Pu (Bodh Gaya) both document large gaps between what records/policy say should be connected and what independent observation finds actually is. If this recurs as more studies are added, it would suggest administrative implementation gaps — not just formal eligibility rules — deserve their own place in the mechanism framework, distinct from DISCRETION_ACCOMMODATION as currently coded.</w:t>
+      </w:r>
+    </w:p>
+    <w:p>
+      <w:pPr>
+        <w:spacing w:after="160"/>
+      </w:pPr>
+      <w:r>
+        <w:rPr>
+          <w:rFonts w:ascii="Calibri" w:cs="Calibri" w:eastAsia="Calibri" w:hAnsi="Calibri"/>
+          <w:sz w:val="22"/>
+          <w:szCs w:val="22"/>
+        </w:rPr>
+        <w:t xml:space="preserve">Both observations are drawn from a handful of studies and could easily not replicate as the other 3,484 unscreened records are assessed. They are recorded here as things to watch, not as conclusions.</w:t>
+      </w:r>
+    </w:p>
+    <w:p>
+      <w:pPr>
+        <w:pStyle w:val="Heading1"/>
+        <w:spacing w:after="160" w:before="320"/>
+      </w:pPr>
+      <w:r>
+        <w:rPr>
+          <w:rFonts w:ascii="Calibri" w:cs="Calibri" w:eastAsia="Calibri" w:hAnsi="Calibri"/>
+          <w:b/>
+          <w:bCs/>
+        </w:rPr>
+        <w:t xml:space="preserve">8. Preliminary Conclusion (Exploratory, Highly Provisional)</w:t>
+      </w:r>
+    </w:p>
+    <w:p>
+      <w:pPr>
+        <w:spacing w:after="160"/>
+      </w:pPr>
+      <w:r>
+        <w:rPr>
+          <w:rFonts w:ascii="Calibri" w:cs="Calibri" w:eastAsia="Calibri" w:hAnsi="Calibri"/>
+          <w:sz w:val="22"/>
+          <w:szCs w:val="22"/>
+        </w:rPr>
+        <w:t xml:space="preserve">At this very early stage — 4.8% of full-text screening complete, zero risk-of-bias appraisals performed, and no formal synthesis-feasibility determination made — the assembled evidence has not contradicted the Legal Last Mile framework and includes a small number of studies whose results are consistent with it. That is the entire honest content of this “preliminary conclusion.” It is not evidence the framework is correct, it is not a basis for policy or legal argument, and it should not be quoted or cited as this review's finding: a review that is 4.8% through its full-text pool cannot yet say whether the framework is supported, qualified, or rejected, and asserting otherwise would be exactly the premature conclusion PROJECT_SPEC.md §1 was written to prevent. The actual conclusion — the one worth relying on — depends on completing full-text screening, applying risk-of-bias appraisal, and running the quantitative-feasibility decision tree against the completed evidence base, none of which has happened yet.</w:t>
+      </w:r>
+    </w:p>
+    <w:p>
+      <w:r>
+        <w:br w:type="page"/>
+      </w:r>
+    </w:p>
+    <w:p>
+      <w:pPr>
+        <w:pStyle w:val="Heading1"/>
+        <w:spacing w:after="160" w:before="320"/>
+      </w:pPr>
+      <w:r>
+        <w:rPr>
+          <w:rFonts w:ascii="Calibri" w:cs="Calibri" w:eastAsia="Calibri" w:hAnsi="Calibri"/>
+          <w:b/>
+          <w:bCs/>
+        </w:rPr>
+        <w:t xml:space="preserve">9. Current Status by PRISMA Phase</w:t>
       </w:r>
     </w:p>
     <w:tbl>
@@ -5459,7 +6561,7 @@
           <w:b/>
           <w:bCs/>
         </w:rPr>
-        <w:t xml:space="preserve">7. Why This Report Stops Here</w:t>
+        <w:t xml:space="preserve">10. Why §6–8 Are Sketches, Not the Review's Findings</w:t>
       </w:r>
     </w:p>
     <w:p>
@@ -5490,7 +6592,7 @@
           <w:sz w:val="22"/>
           <w:szCs w:val="22"/>
         </w:rPr>
-        <w:t xml:space="preserve"> — not the reverse. 07_manuscript/draft/manuscript_outline.md correspondingly marks Results, Discussion, Comparative Findings, and Conclusion as sections that “may not be drafted from assumption, illustration, or the preliminary source papers alone,” pending the corresponding phase of work. That constraint is not a formality here: with risk-of-bias appraisal unrun and only 4.8% of the full-text pool assessed, any Results or Discussion section written today would necessarily be either empty or an illustration dressed up as a finding — precisely the outcome the project's anti-confirmation-bias rule exists to prevent. This report therefore ends at the descriptive status the evidence currently supports.</w:t>
+        <w:t xml:space="preserve"> — not the reverse. 07_manuscript/draft/manuscript_outline.md correspondingly marks Results, Discussion, Comparative Findings, and Conclusion as sections that “may not be drafted from assumption, illustration, or the preliminary source papers alone,” pending the corresponding phase of work. §6–8 above exist only because the researcher explicitly asked for a labeled exploratory version despite that rule, and they are written to make the rule's logic visible rather than to quietly sidestep it: with risk-of-bias appraisal unrun and only 4.8% of the full-text pool assessed, a Results/Discussion/Conclusion written today can only ever be an illustration, never a finding. The version of §6–8 that actually counts — the one this project's own rules permit treating as a result — requires full-text screening to close, risk-of-bias appraisal to run against the official instruments, and ANALYSIS_PLAN.md's feasibility decision tree to be applied to the completed evidence base. None of that has happened. Until it has, §6–8 should be read exactly as labeled: a sketch.</w:t>
       </w:r>
     </w:p>
     <w:p>
@@ -5504,7 +6606,7 @@
           <w:b/>
           <w:bCs/>
         </w:rPr>
-        <w:t xml:space="preserve">8. Limitations of This Interim Report Itself</w:t>
+        <w:t xml:space="preserve">11. Limitations of This Interim Report Itself</w:t>
       </w:r>
     </w:p>
     <w:p>
@@ -5645,6 +6747,62 @@
           <w:szCs w:val="22"/>
         </w:rPr>
         <w:t xml:space="preserve"> The 37/85 “quantitative-synthesis eligible” flag is a per-study data property, not a decision that pooling any family is warranted.</w:t>
+      </w:r>
+    </w:p>
+    <w:p>
+      <w:pPr>
+        <w:pStyle w:val="ListParagraph"/>
+        <w:numPr>
+          <w:ilvl w:val="0"/>
+          <w:numId w:val="1"/>
+        </w:numPr>
+        <w:spacing w:after="100"/>
+      </w:pPr>
+      <w:r>
+        <w:rPr>
+          <w:rFonts w:ascii="Calibri" w:cs="Calibri" w:eastAsia="Calibri" w:hAnsi="Calibri"/>
+          <w:b/>
+          <w:bCs/>
+          <w:sz w:val="22"/>
+          <w:szCs w:val="22"/>
+        </w:rPr>
+        <w:t xml:space="preserve">The §6 “six mechanism-isolating studies” are a hand-read list, not a pre-specified or systematic selection.</w:t>
+      </w:r>
+      <w:r>
+        <w:rPr>
+          <w:rFonts w:ascii="Calibri" w:cs="Calibri" w:eastAsia="Calibri" w:hAnsi="Calibri"/>
+          <w:sz w:val="22"/>
+          <w:szCs w:val="22"/>
+        </w:rPr>
+        <w:t xml:space="preserve"> They were identified by reading extraction notes for comparisons that isolate a legal/administrative exposure, not by a documented inclusion rule — a different reader could reasonably draw the boundary differently, and the list should be regenerated with an explicit rule once screening is further along.</w:t>
+      </w:r>
+    </w:p>
+    <w:p>
+      <w:pPr>
+        <w:pStyle w:val="ListParagraph"/>
+        <w:numPr>
+          <w:ilvl w:val="0"/>
+          <w:numId w:val="1"/>
+        </w:numPr>
+        <w:spacing w:after="100"/>
+      </w:pPr>
+      <w:r>
+        <w:rPr>
+          <w:rFonts w:ascii="Calibri" w:cs="Calibri" w:eastAsia="Calibri" w:hAnsi="Calibri"/>
+          <w:b/>
+          <w:bCs/>
+          <w:sz w:val="22"/>
+          <w:szCs w:val="22"/>
+        </w:rPr>
+        <w:t xml:space="preserve">Selection into “which 85 studies exist yet” is not random.</w:t>
+      </w:r>
+      <w:r>
+        <w:rPr>
+          <w:rFonts w:ascii="Calibri" w:cs="Calibri" w:eastAsia="Calibri" w:hAnsi="Calibri"/>
+          <w:sz w:val="22"/>
+          <w:szCs w:val="22"/>
+        </w:rPr>
+        <w:t xml:space="preserve"> These are whichever full-text PDFs the researcher happened to supply and the reviewer happened to screen first; nothing about the order guarantees representativeness of the eventual 3,659-record pool, and the §6–8 exploratory pattern could look entirely different once more of that pool is screened.</w:t>
       </w:r>
     </w:p>
     <w:p>

</xml_diff>